<commit_message>
Address reviewer feedback: rigor and front matter for Section 6/7
- Fill in real authors, affiliation and corresponding email in the front
  matter (matching the version already submitted/reviewed), replacing the
  template placeholders that were still in this branch.
- Reframe topology-inference confidence-graded language as explicit
  evidentiary tiers (deterministic vs heuristic) rather than an implied
  statistically calibrated confidence score (Abstract, 2.5, 4.4, Table 2).
- Split Discussion into 7.1 Limitations and threats to validity (concrete,
  actionable protocols for statistical rigor on Table 3, ground-truth
  topology validation, and a quantitative Oxidized comparison on the
  modern segment), 7.2 Design limitations and security considerations,
  and 7.3 Pedagogical dimension.
- Soften overclaiming language in Abstract/Conclusions to reflect the
  single-site, log-derived nature of the pilot evaluation.
</commit_message>
<xml_diff>
--- a/paper/RCES_Paper_AutoRedes_III.docx
+++ b/paper/RCES_Paper_AutoRedes_III.docx
@@ -520,9 +520,11 @@
             <w:r>
               <w:rPr>
                 <w:rFonts w:ascii="Times New Roman" w:cs="Times New Roman" w:eastAsia="Times New Roman" w:hAnsi="Times New Roman"/>
-                <w:rtl w:val="0"/>
-              </w:rPr>
-              <w:t xml:space="preserve">Aaa Surname</w:t>
+                <w:sz w:val="20"/>
+                <w:szCs w:val="20"/>
+                <w:rtl w:val="0"/>
+              </w:rPr>
+              <w:t xml:space="preserve">María C. Abeledo</w:t>
             </w:r>
             <w:r>
               <w:rPr>
@@ -538,7 +540,7 @@
                 <wp:inline distB="0" distT="0" distL="0" distR="0">
                   <wp:extent cx="107950" cy="107950"/>
                   <wp:effectExtent b="0" l="0" r="0" t="0"/>
-                  <wp:docPr id="4" name="image4.jpg"/>
+                  <wp:docPr id="200" name="image4.jpg"/>
                   <a:graphic>
                     <a:graphicData uri="http://schemas.openxmlformats.org/drawingml/2006/picture">
                       <pic:pic>
@@ -570,9 +572,11 @@
             <w:r>
               <w:rPr>
                 <w:rFonts w:ascii="Times New Roman" w:cs="Times New Roman" w:eastAsia="Times New Roman" w:hAnsi="Times New Roman"/>
-                <w:rtl w:val="0"/>
-              </w:rPr>
-              <w:t xml:space="preserve">, Bbb B. Surname</w:t>
+                <w:sz w:val="20"/>
+                <w:szCs w:val="20"/>
+                <w:rtl w:val="0"/>
+              </w:rPr>
+              <w:t xml:space="preserve">, Daniel A. Priano</w:t>
             </w:r>
             <w:r>
               <w:rPr>
@@ -580,7 +584,7 @@
                 <w:vertAlign w:val="superscript"/>
                 <w:rtl w:val="0"/>
               </w:rPr>
-              <w:t xml:space="preserve">2</w:t>
+              <w:t xml:space="preserve">1</w:t>
             </w:r>
             <w:r>
               <w:rPr/>
@@ -588,7 +592,7 @@
                 <wp:inline distB="0" distT="0" distL="0" distR="0">
                   <wp:extent cx="107950" cy="107950"/>
                   <wp:effectExtent b="0" l="0" r="0" t="0"/>
-                  <wp:docPr id="3" name="image4.jpg"/>
+                  <wp:docPr id="201" name="image4.jpg"/>
                   <a:graphic>
                     <a:graphicData uri="http://schemas.openxmlformats.org/drawingml/2006/picture">
                       <pic:pic>
@@ -620,9 +624,11 @@
             <w:r>
               <w:rPr>
                 <w:rFonts w:ascii="Times New Roman" w:cs="Times New Roman" w:eastAsia="Times New Roman" w:hAnsi="Times New Roman"/>
-                <w:rtl w:val="0"/>
-              </w:rPr>
-              <w:t xml:space="preserve">, Ccc C.C. Surname</w:t>
+                <w:sz w:val="20"/>
+                <w:szCs w:val="20"/>
+                <w:rtl w:val="0"/>
+              </w:rPr>
+              <w:t xml:space="preserve">, Matías A. Marsicano</w:t>
             </w:r>
             <w:r>
               <w:rPr>
@@ -630,7 +636,7 @@
                 <w:vertAlign w:val="superscript"/>
                 <w:rtl w:val="0"/>
               </w:rPr>
-              <w:t xml:space="preserve">3</w:t>
+              <w:t xml:space="preserve">1</w:t>
             </w:r>
             <w:r>
               <w:rPr/>
@@ -638,7 +644,7 @@
                 <wp:inline distB="0" distT="0" distL="0" distR="0">
                   <wp:extent cx="107950" cy="107950"/>
                   <wp:effectExtent b="0" l="0" r="0" t="0"/>
-                  <wp:docPr id="5" name="image4.jpg"/>
+                  <wp:docPr id="202" name="image4.jpg"/>
                   <a:graphic>
                     <a:graphicData uri="http://schemas.openxmlformats.org/drawingml/2006/picture">
                       <pic:pic>
@@ -670,6 +676,162 @@
             <w:r>
               <w:rPr>
                 <w:rFonts w:ascii="Times New Roman" w:cs="Times New Roman" w:eastAsia="Times New Roman" w:hAnsi="Times New Roman"/>
+                <w:sz w:val="20"/>
+                <w:szCs w:val="20"/>
+                <w:rtl w:val="0"/>
+              </w:rPr>
+              <w:t xml:space="preserve">, Ximena Salazar Gallardo</w:t>
+            </w:r>
+            <w:r>
+              <w:rPr>
+                <w:rFonts w:ascii="Times New Roman" w:cs="Times New Roman" w:eastAsia="Times New Roman" w:hAnsi="Times New Roman"/>
+                <w:vertAlign w:val="superscript"/>
+                <w:rtl w:val="0"/>
+              </w:rPr>
+              <w:t xml:space="preserve">1</w:t>
+            </w:r>
+            <w:r>
+              <w:rPr/>
+              <w:drawing>
+                <wp:inline distB="0" distT="0" distL="0" distR="0">
+                  <wp:extent cx="107950" cy="107950"/>
+                  <wp:effectExtent b="0" l="0" r="0" t="0"/>
+                  <wp:docPr id="203" name="image4.jpg"/>
+                  <a:graphic>
+                    <a:graphicData uri="http://schemas.openxmlformats.org/drawingml/2006/picture">
+                      <pic:pic>
+                        <pic:nvPicPr>
+                          <pic:cNvPr id="0" name="image4.jpg"/>
+                          <pic:cNvPicPr preferRelativeResize="0"/>
+                        </pic:nvPicPr>
+                        <pic:blipFill>
+                          <a:blip r:embed="rId9"/>
+                          <a:srcRect b="0" l="0" r="0" t="0"/>
+                          <a:stretch>
+                            <a:fillRect/>
+                          </a:stretch>
+                        </pic:blipFill>
+                        <pic:spPr>
+                          <a:xfrm>
+                            <a:off x="0" y="0"/>
+                            <a:ext cx="107950" cy="107950"/>
+                          </a:xfrm>
+                          <a:prstGeom prst="rect"/>
+                          <a:ln/>
+                        </pic:spPr>
+                      </pic:pic>
+                    </a:graphicData>
+                  </a:graphic>
+                </wp:inline>
+              </w:drawing>
+            </w:r>
+            <w:r>
+              <w:rPr>
+                <w:rFonts w:ascii="Times New Roman" w:cs="Times New Roman" w:eastAsia="Times New Roman" w:hAnsi="Times New Roman"/>
+                <w:sz w:val="20"/>
+                <w:szCs w:val="20"/>
+                <w:rtl w:val="0"/>
+              </w:rPr>
+              <w:t xml:space="preserve">, Alejandro J. Guevara</w:t>
+            </w:r>
+            <w:r>
+              <w:rPr>
+                <w:rFonts w:ascii="Times New Roman" w:cs="Times New Roman" w:eastAsia="Times New Roman" w:hAnsi="Times New Roman"/>
+                <w:vertAlign w:val="superscript"/>
+                <w:rtl w:val="0"/>
+              </w:rPr>
+              <w:t xml:space="preserve">1</w:t>
+            </w:r>
+            <w:r>
+              <w:rPr/>
+              <w:drawing>
+                <wp:inline distB="0" distT="0" distL="0" distR="0">
+                  <wp:extent cx="107950" cy="107950"/>
+                  <wp:effectExtent b="0" l="0" r="0" t="0"/>
+                  <wp:docPr id="204" name="image4.jpg"/>
+                  <a:graphic>
+                    <a:graphicData uri="http://schemas.openxmlformats.org/drawingml/2006/picture">
+                      <pic:pic>
+                        <pic:nvPicPr>
+                          <pic:cNvPr id="0" name="image4.jpg"/>
+                          <pic:cNvPicPr preferRelativeResize="0"/>
+                        </pic:nvPicPr>
+                        <pic:blipFill>
+                          <a:blip r:embed="rId9"/>
+                          <a:srcRect b="0" l="0" r="0" t="0"/>
+                          <a:stretch>
+                            <a:fillRect/>
+                          </a:stretch>
+                        </pic:blipFill>
+                        <pic:spPr>
+                          <a:xfrm>
+                            <a:off x="0" y="0"/>
+                            <a:ext cx="107950" cy="107950"/>
+                          </a:xfrm>
+                          <a:prstGeom prst="rect"/>
+                          <a:ln/>
+                        </pic:spPr>
+                      </pic:pic>
+                    </a:graphicData>
+                  </a:graphic>
+                </wp:inline>
+              </w:drawing>
+            </w:r>
+            <w:r>
+              <w:rPr>
+                <w:rFonts w:ascii="Times New Roman" w:cs="Times New Roman" w:eastAsia="Times New Roman" w:hAnsi="Times New Roman"/>
+                <w:sz w:val="20"/>
+                <w:szCs w:val="20"/>
+                <w:rtl w:val="0"/>
+              </w:rPr>
+              <w:t xml:space="preserve">, Cristian C. Villafañez</w:t>
+            </w:r>
+            <w:r>
+              <w:rPr>
+                <w:rFonts w:ascii="Times New Roman" w:cs="Times New Roman" w:eastAsia="Times New Roman" w:hAnsi="Times New Roman"/>
+                <w:vertAlign w:val="superscript"/>
+                <w:rtl w:val="0"/>
+              </w:rPr>
+              <w:t xml:space="preserve">1</w:t>
+            </w:r>
+            <w:r>
+              <w:rPr/>
+              <w:drawing>
+                <wp:inline distB="0" distT="0" distL="0" distR="0">
+                  <wp:extent cx="107950" cy="107950"/>
+                  <wp:effectExtent b="0" l="0" r="0" t="0"/>
+                  <wp:docPr id="205" name="image4.jpg"/>
+                  <a:graphic>
+                    <a:graphicData uri="http://schemas.openxmlformats.org/drawingml/2006/picture">
+                      <pic:pic>
+                        <pic:nvPicPr>
+                          <pic:cNvPr id="0" name="image4.jpg"/>
+                          <pic:cNvPicPr preferRelativeResize="0"/>
+                        </pic:nvPicPr>
+                        <pic:blipFill>
+                          <a:blip r:embed="rId9"/>
+                          <a:srcRect b="0" l="0" r="0" t="0"/>
+                          <a:stretch>
+                            <a:fillRect/>
+                          </a:stretch>
+                        </pic:blipFill>
+                        <pic:spPr>
+                          <a:xfrm>
+                            <a:off x="0" y="0"/>
+                            <a:ext cx="107950" cy="107950"/>
+                          </a:xfrm>
+                          <a:prstGeom prst="rect"/>
+                          <a:ln/>
+                        </pic:spPr>
+                      </pic:pic>
+                    </a:graphicData>
+                  </a:graphic>
+                </wp:inline>
+              </w:drawing>
+            </w:r>
+            <w:r>
+              <w:rPr>
+                <w:rFonts w:ascii="Times New Roman" w:cs="Times New Roman" w:eastAsia="Times New Roman" w:hAnsi="Times New Roman"/>
                 <w:vertAlign w:val="superscript"/>
                 <w:rtl w:val="0"/>
               </w:rPr>
@@ -752,76 +914,32 @@
             <w:r>
               <w:rPr>
                 <w:rFonts w:ascii="Times New Roman" w:cs="Times New Roman" w:eastAsia="Times New Roman" w:hAnsi="Times New Roman"/>
-                <w:rtl w:val="0"/>
-              </w:rPr>
-              <w:t xml:space="preserve">Affiliation, address </w:t>
-            </w:r>
-          </w:p>
-          <w:p>
-            <w:pPr>
-              <w:jc w:val="left"/>
-              <w:rPr>
-                <w:rFonts w:ascii="Times New Roman" w:cs="Times New Roman" w:eastAsia="Times New Roman" w:hAnsi="Times New Roman"/>
-              </w:rPr>
-            </w:pPr>
-            <w:r>
+                <w:sz w:val="20"/>
+                <w:szCs w:val="20"/>
+                <w:rtl w:val="0"/>
+              </w:rPr>
+              <w:t xml:space="preserve">Research and Development Center in Computer Science (CIDI), National University of San Martín (UNSAM), San Martín, Argentina</w:t>
+            </w:r>
+          </w:p>
+          <w:p>
+            <w:pPr>
+              <w:jc w:val="left"/>
+              <w:rPr>
+                <w:rFonts w:ascii="Times New Roman" w:cs="Times New Roman" w:eastAsia="Times New Roman" w:hAnsi="Times New Roman"/>
+              </w:rPr>
+            </w:pPr>
+            <w:r>
+              <w:rPr>
+                <w:rtl w:val="0"/>
+              </w:rPr>
+            </w:r>
+          </w:p>
+          <w:p>
+            <w:pPr>
+              <w:jc w:val="left"/>
               <w:rPr>
                 <w:rFonts w:ascii="Times New Roman" w:cs="Times New Roman" w:eastAsia="Times New Roman" w:hAnsi="Times New Roman"/>
                 <w:vertAlign w:val="superscript"/>
-                <w:rtl w:val="0"/>
-              </w:rPr>
-              <w:t xml:space="preserve">2 </w:t>
-            </w:r>
-            <w:r>
-              <w:rPr>
-                <w:rFonts w:ascii="Times New Roman" w:cs="Times New Roman" w:eastAsia="Times New Roman" w:hAnsi="Times New Roman"/>
-                <w:rtl w:val="0"/>
-              </w:rPr>
-              <w:t xml:space="preserve">Affiliation, address </w:t>
-            </w:r>
-          </w:p>
-          <w:p>
-            <w:pPr>
-              <w:jc w:val="left"/>
-              <w:rPr>
-                <w:rFonts w:ascii="Times New Roman" w:cs="Times New Roman" w:eastAsia="Times New Roman" w:hAnsi="Times New Roman"/>
-              </w:rPr>
-            </w:pPr>
-            <w:r>
-              <w:rPr>
-                <w:rFonts w:ascii="Times New Roman" w:cs="Times New Roman" w:eastAsia="Times New Roman" w:hAnsi="Times New Roman"/>
-                <w:vertAlign w:val="superscript"/>
-                <w:rtl w:val="0"/>
-              </w:rPr>
-              <w:t xml:space="preserve">3 </w:t>
-            </w:r>
-            <w:r>
-              <w:rPr>
-                <w:rFonts w:ascii="Times New Roman" w:cs="Times New Roman" w:eastAsia="Times New Roman" w:hAnsi="Times New Roman"/>
-                <w:rtl w:val="0"/>
-              </w:rPr>
-              <w:t xml:space="preserve">Affiliation, address </w:t>
-            </w:r>
-          </w:p>
-          <w:p>
-            <w:pPr>
-              <w:jc w:val="left"/>
-              <w:rPr>
-                <w:rFonts w:ascii="Times New Roman" w:cs="Times New Roman" w:eastAsia="Times New Roman" w:hAnsi="Times New Roman"/>
-              </w:rPr>
-            </w:pPr>
-            <w:r>
-              <w:rPr>
-                <w:rtl w:val="0"/>
-              </w:rPr>
-            </w:r>
-          </w:p>
-          <w:p>
-            <w:pPr>
-              <w:jc w:val="left"/>
-              <w:rPr>
-                <w:rFonts w:ascii="Times New Roman" w:cs="Times New Roman" w:eastAsia="Times New Roman" w:hAnsi="Times New Roman"/>
-                <w:vertAlign w:val="superscript"/>
               </w:rPr>
             </w:pPr>
             <w:r>
@@ -833,8 +951,12 @@
             </w:r>
             <w:r>
               <w:rPr>
-                <w:rtl w:val="0"/>
-              </w:rPr>
+                <w:rFonts w:ascii="Times New Roman" w:cs="Times New Roman" w:eastAsia="Times New Roman" w:hAnsi="Times New Roman"/>
+                <w:sz w:val="20"/>
+                <w:szCs w:val="20"/>
+                <w:rtl w:val="0"/>
+              </w:rPr>
+              <w:t xml:space="preserve"> mabeledo@unsam.edu.ar</w:t>
             </w:r>
           </w:p>
         </w:tc>
@@ -1153,7 +1275,7 @@
                 <w:szCs w:val="18"/>
                 <w:rtl w:val="0"/>
               </w:rPr>
-              <w:t xml:space="preserve">In institutional and educational network infrastructures, the coexistence of equipment from multiple generations and vendors poses critical challenges for administration, operational continuity, and configuration auditing. Legacy devices impose constraints that standard industry platforms do not contemplate: obsolete cryptographic protocols, non-standardized interactive authentication mechanisms, restrictive management consoles, and the absence of persistent neighbor-discovery protocols (LLDP/CDP) in the saved configuration. This paper presents the design, architecture, and evaluation of an integral Network Configuration Management (NCM) platform developed within the Network Automation Project III. The solution implements an automated, transactional backup workflow over Git; a granular syntactic comparison engine (side-by-side diffs) with volatile-parameter filtering; a Layer-2/Layer-3 topology inference algorithm based on static configuration analysis with confidence-graded link classification; and a staged-diagnosis scheme with credential quarantine for the active protection of the infrastructure. A hardware simulator (digital twin) reproduces the behavioral anomalies of real legacy devices, allowing the software to be certified without operational risk. Results from the pilot deployment show a reduction of per-device backup time from 5-15 minutes to 15-45 seconds, full-network unattended backup in under 4 minutes, a mean time to recovery below 2 minutes, and a fully auditable configuration history with no false-positive commits. The engineering rationale for a purpose-built solution over reference tools such as Oxidized, the operational constraints assumed, and future lines of work are also discussed.</w:t>
+              <w:t xml:space="preserve">In institutional and educational network infrastructures, the coexistence of equipment from multiple generations and vendors poses critical challenges for administration, operational continuity, and configuration auditing. Legacy devices impose constraints that standard industry platforms do not contemplate: obsolete cryptographic protocols, non-standardized interactive authentication mechanisms, restrictive management consoles, and the absence of persistent neighbor-discovery protocols (LLDP/CDP) in the saved configuration. This paper presents the design, architecture, and evaluation of an integral Network Configuration Management (NCM) platform developed within the Network Automation Project III. The solution implements an automated, transactional backup workflow over Git; a granular syntactic comparison engine (side-by-side diffs) with volatile-parameter filtering; a Layer-2/Layer-3 topology inference algorithm based on static configuration analysis, whose inferred links are classified into transparent evidentiary tiers rather than presented as a single undifferentiated map; and a staged-diagnosis scheme with credential quarantine for the active protection of the infrastructure. A hardware simulator (digital twin) reproduces the behavioral anomalies of real legacy devices, allowing the software to be certified without operational risk. Field observations from the pilot deployment indicate a reduction of per-device backup time from 5-15 minutes to 15-45 seconds, full-network unattended backup in under 4 minutes, a mean time to recovery below 2 minutes, and a fully auditable configuration history with no false-positive commits observed. The engineering rationale for a purpose-built solution over reference tools such as Oxidized, the operational constraints assumed - including the single-site, log-derived nature of this evaluation - and future lines of work are also discussed.</w:t>
             </w:r>
           </w:p>
         </w:tc>
@@ -1728,7 +1850,7 @@
           <w:szCs w:val="20"/>
           <w:rtl w:val="0"/>
         </w:rPr>
-        <w:t xml:space="preserve">The reviewed literature exhibits a consistent pattern: mature NCM tooling [1-4] assumes standards-compliant devices and treats legacy anomalies as extension cases to be programmed ad hoc; guidance on SSH cryptography [7] resolves the legacy-interoperability tension only at the cost of host-wide security relaxation; and automated topology mapping presupposes active discovery protocols [8, 20] that legacy environments frequently lack. To the best of the authors' knowledge, no documented open-source platform simultaneously provides (i) session-scoped negotiation with obsolete SSH stacks that preserves the management host's security posture, (ii) collection semantics designed around the lockout policies of devices with local AAA (credential quarantine, bounded retries), (iii) confidence-graded topology inference performed purely by static configuration analysis, and (iv) a zero-infrastructure deployment model suited to institutional and educational settings. This combination is the research gap addressed by the present work.</w:t>
+        <w:t xml:space="preserve">The reviewed literature exhibits a consistent pattern: mature NCM tooling [1-4] assumes standards-compliant devices and treats legacy anomalies as extension cases to be programmed ad hoc; guidance on SSH cryptography [7] resolves the legacy-interoperability tension only at the cost of host-wide security relaxation; and automated topology mapping presupposes active discovery protocols [8, 20] that legacy environments frequently lack. To the best of the authors' knowledge, no documented open-source platform simultaneously provides (i) session-scoped negotiation with obsolete SSH stacks that preserves the management host's security posture, (ii) collection semantics designed around the lockout policies of devices with local AAA (credential quarantine, bounded retries), (iii) a transparent, evidence-tiered approach to topology inference performed purely by static configuration analysis, distinguishing deterministic from heuristic evidence, and (iv) a zero-infrastructure deployment model suited to institutional and educational settings. This combination is the research gap addressed by the present work.</w:t>
       </w:r>
     </w:p>
     <w:p>
@@ -2931,7 +3053,7 @@
           <w:szCs w:val="20"/>
           <w:rtl w:val="0"/>
         </w:rPr>
-        <w:t xml:space="preserve">The topology subsystem syntactically analyzes the stored configuration files and reconstructs the connectivity graph of the network without emitting any additional traffic. Evidence is classified by confidence level, as summarized in Table 2: at the level of absolute certainty, point-to-point links are identified over /30 or /31 subnets shared unambiguously between Layer-3 interfaces [17]; at the high-probability level, the engine cross-correlates transport VLANs on trunk interfaces, explicit port descriptions, and adjacencies on management subnets, requiring independent corroboration between sources. In addition, the analyzer proactively reports configuration anomalies (findings), such as switch virtual interfaces (SVIs) with out-of-range addressing, link aggregation groups (LAGs) with no member interfaces, or discrepancies between the active configuration and the declared inventory.</w:t>
+        <w:t xml:space="preserve">The topology subsystem syntactically analyzes the stored configuration files and reconstructs the connectivity graph of the network without emitting any additional traffic. Inferred links are classified into evidentiary tiers, as summarized in Table 2, that reflect the logical or heuristic strength of the static evidence behind each link - not a statistically calibrated confidence score: at the deterministic tier, point-to-point links are identified over /30 or /31 subnets shared unambiguously between Layer-3 interfaces [17], a case in which the subnet's uniqueness constitutes a logical proof rather than a probabilistic estimate; at the heuristic tier, the engine cross-correlates transport VLANs on trunk interfaces, explicit port descriptions, and adjacencies on management subnets, requiring independent corroboration between sources. In addition, the analyzer proactively reports configuration anomalies (findings), such as switch virtual interfaces (SVIs) with out-of-range addressing, link aggregation groups (LAGs) with no member interfaces, or discrepancies between the active configuration and the declared inventory. This classification has not yet been validated against a ground-truth topology; Section 7.1 discusses the gap and the protocol required to close it.</w:t>
       </w:r>
     </w:p>
     <w:p>
@@ -2962,7 +3084,7 @@
           <w:szCs w:val="20"/>
           <w:rtl w:val="0"/>
         </w:rPr>
-        <w:t xml:space="preserve">Evidence levels of the static topology-inference engine</w:t>
+        <w:t xml:space="preserve">Evidentiary tiers of the static topology-inference engine</w:t>
       </w:r>
     </w:p>
     <w:p>
@@ -3008,7 +3130,7 @@
                 <w:szCs w:val="18"/>
                 <w:rtl w:val="0"/>
               </w:rPr>
-              <w:t xml:space="preserve">Confidence level</w:t>
+              <w:t xml:space="preserve">Evidentiary tier</w:t>
             </w:r>
           </w:p>
         </w:tc>
@@ -3077,7 +3199,7 @@
                 <w:szCs w:val="18"/>
                 <w:rtl w:val="0"/>
               </w:rPr>
-              <w:t xml:space="preserve">Absolute certainty</w:t>
+              <w:t xml:space="preserve">Deterministic</w:t>
             </w:r>
           </w:p>
         </w:tc>
@@ -3142,7 +3264,7 @@
                 <w:szCs w:val="18"/>
                 <w:rtl w:val="0"/>
               </w:rPr>
-              <w:t xml:space="preserve">High probability</w:t>
+              <w:t xml:space="preserve">Heuristic (cross-corroborated)</w:t>
             </w:r>
           </w:p>
         </w:tc>
@@ -3618,7 +3740,7 @@
           <w:szCs w:val="20"/>
           <w:rtl w:val="0"/>
         </w:rPr>
-        <w:t xml:space="preserve">Table 3 contrasts the key operational indicators before and after the deployment of the platform in the institutional network. Automated figures were obtained from the platform's own execution logs during the pilot phase: per-device times correspond to complete collection cycles (session establishment, authentication, capture, volatile filtering, and commit) across the device families of Table 1, and the recovery time corresponds to retrieving a device's last committed configuration from the version store and reapplying it. Figures for the traditional method reflect the documented operational practice of the institution prior to the deployment.</w:t>
+        <w:t xml:space="preserve">Table 3 contrasts the key operational indicators before and after the deployment of the platform in the institutional network. Automated figures were obtained from the platform's own execution logs during the pilot phase: per-device times correspond to complete collection cycles (session establishment, authentication, capture, volatile filtering, and commit) across the device families of Table 1, and the recovery time corresponds to retrieving a device's last committed configuration from the version store and reapplying it. Figures for the traditional method reflect the documented operational practice of the institution prior to the deployment. These figures characterize the observed range across the deployment's device population during a single institutional pilot, rather than a controlled multi-trial statistical sample with reported sample size and dispersion; Section 7.1 discusses this methodological gap and the protocol required to close it.</w:t>
       </w:r>
     </w:p>
     <w:p>
@@ -4115,7 +4237,7 @@
           <w:szCs w:val="20"/>
           <w:rtl w:val="0"/>
         </w:rPr>
-        <w:t xml:space="preserve">During the initial phase, widely adopted tools - particularly Oxidized [1] - were evaluated against the requirements of the legacy park. Table 4 synthesizes the technical rationale that motivated a purpose-built solution.</w:t>
+        <w:t xml:space="preserve">During the initial phase, widely adopted tools - particularly Oxidized [1] - were evaluated against the requirements of the legacy park. Table 4 synthesizes the technical rationale that motivated a purpose-built solution. This comparison is qualitative rather than measured; Section 7.1 explains why and outlines a concrete protocol for a quantitative, timed comparison restricted to the modern segment of the network.</w:t>
       </w:r>
     </w:p>
     <w:p>
@@ -4979,58 +5101,8 @@
           <w:szCs w:val="20"/>
           <w:rtl w:val="0"/>
         </w:rPr>
-        <w:t xml:space="preserve">The static topology-inference approach trades completeness for safety. Because it emits no traffic and requires no discovery protocols on the devices [8], it can be applied to the most fragile segments of the network; its cost is that VLAN-level deductions identify trunk adjacency but not always the exact physical port, which is precisely the gap the planned MAC-table ingestion addresses (Section 9). The confidence-graded model (Table 2) makes this limitation explicit to the operator instead of presenting all inferred links as equally reliable.</w:t>
-      </w:r>
-    </w:p>
-    <w:p>
-      <w:pPr>
-        <w:ind w:firstLine="202"/>
-        <w:rPr/>
-      </w:pPr>
-      <w:r>
-        <w:rPr>
-          <w:rFonts w:ascii="Times New Roman" w:cs="Times New Roman" w:eastAsia="Times New Roman" w:hAnsi="Times New Roman"/>
-          <w:sz w:val="20"/>
-          <w:szCs w:val="20"/>
-          <w:rtl w:val="0"/>
-        </w:rPr>
-        <w:t xml:space="preserve">A limitation of the present evaluation is its scope: the reported metrics come from a single institutional deployment, measured through the platform's own logs rather than an independent benchmark campaign, and no controlled head-to-head measurement against Oxidized was possible on the legacy segments precisely because the generic tool could not operate safely on them (Section 6.2). The comparison in Table 4 is therefore qualitative on those vectors, and a quantitative comparison restricted to the modern segments of the network is left as a complementary exercise.</w:t>
-      </w:r>
-    </w:p>
-    <w:p>
-      <w:pPr>
-        <w:ind w:firstLine="202"/>
-        <w:rPr/>
-      </w:pPr>
-      <w:r>
-        <w:rPr>
-          <w:rFonts w:ascii="Times New Roman" w:cs="Times New Roman" w:eastAsia="Times New Roman" w:hAnsi="Times New Roman"/>
-          <w:sz w:val="20"/>
-          <w:szCs w:val="20"/>
-          <w:rtl w:val="0"/>
-        </w:rPr>
-        <w:t xml:space="preserve">Three design limitations and security considerations deserve emphasis. First, controlled concurrency and commit serialization protect both the management CPU of older switches and the consistency of the Git index, at the cost of a bounded increase in total collection time - an acceptable trade-off given the sub-4-minute full-network figure (Table 3). Second, configuration dumps contain password hashes and SNMP management parameters; the repository must therefore reside in a strictly private environment, and the system complementarily integrates a cryptographic sanitization module for contexts that require secret anonymization [21]. Third, the formal distinction between production-validated and simulator-validated drivers acknowledges that a digital twin, however faithful [18], cannot fully substitute first-contact validation on real hardware.</w:t>
-      </w:r>
-    </w:p>
-    <w:p>
-      <w:pPr>
-        <w:ind w:firstLine="202"/>
-        <w:rPr/>
-      </w:pPr>
-      <w:r>
-        <w:rPr>
-          <w:rFonts w:ascii="Times New Roman" w:cs="Times New Roman" w:eastAsia="Times New Roman" w:hAnsi="Times New Roman"/>
-          <w:sz w:val="20"/>
-          <w:szCs w:val="20"/>
-          <w:rtl w:val="0"/>
-        </w:rPr>
-        <w:t xml:space="preserve">Finally, the project has a deliberate pedagogical dimension. Developed within the Network Automation Project III, the system articulates data-network concepts (link and network layers, VLANs, routing) with modern software-engineering practice (version control, API design, concurrency, text analysis), and its fully documented development serves as reference material and a laboratory base for future academic cohorts.</w:t>
-      </w:r>
-    </w:p>
-    <w:p>
-      <w:pPr>
-        <w:rPr/>
-      </w:pPr>
+        <w:t xml:space="preserve">The static topology-inference approach trades completeness for safety. Because it emits no traffic and requires no discovery protocols on the devices [8], it can be applied to the most fragile segments of the network; its cost is that VLAN-level deductions identify trunk adjacency but not always the exact physical port, which is precisely the gap the planned MAC-table ingestion addresses (Section 9). Table 2 grades inferred links by the strength of their static evidence rather than presenting them as uniformly reliable; Section 7.1 discusses why this remains a transparency safeguard rather than a statistically validated metric.</w:t>
+      </w:r>
     </w:p>
     <w:p>
       <w:pPr>
@@ -5055,6 +5127,194 @@
           <w:szCs w:val="20"/>
           <w:rtl w:val="0"/>
         </w:rPr>
+        <w:t xml:space="preserve">7.1 Limitations and threats to validity</w:t>
+      </w:r>
+    </w:p>
+    <w:p>
+      <w:pPr>
+        <w:rPr/>
+      </w:pPr>
+    </w:p>
+    <w:p>
+      <w:pPr>
+        <w:ind w:firstLine="202"/>
+        <w:rPr/>
+      </w:pPr>
+      <w:r>
+        <w:rPr>
+          <w:rFonts w:ascii="Times New Roman" w:cs="Times New Roman" w:eastAsia="Times New Roman" w:hAnsi="Times New Roman"/>
+          <w:sz w:val="20"/>
+          <w:szCs w:val="20"/>
+          <w:rtl w:val="0"/>
+        </w:rPr>
+        <w:t xml:space="preserve">The present evaluation has three concrete gaps that a demanding empirical standard should flag explicitly, and each has a well-defined path to closure that the authors have not yet executed.</w:t>
+      </w:r>
+    </w:p>
+    <w:p>
+      <w:pPr>
+        <w:ind w:firstLine="202"/>
+        <w:rPr/>
+      </w:pPr>
+      <w:r>
+        <w:rPr>
+          <w:rFonts w:ascii="Times New Roman" w:cs="Times New Roman" w:eastAsia="Times New Roman" w:hAnsi="Times New Roman"/>
+          <w:sz w:val="20"/>
+          <w:szCs w:val="20"/>
+          <w:rtl w:val="0"/>
+        </w:rPr>
+        <w:t xml:space="preserve">First, statistical rigor of the operational metrics (Table 3): the reported ranges were read directly from the platform's execution logs during a single institutional deployment, without recording the sample size (number of devices per family, number of collection cycles) or computing dispersion statistics. A rigorous version of this evaluation would log the start and end timestamp of every collection cycle, report n per device family together with mean ± standard deviation - or, given the expected skew toward slower legacy devices, median and interquartile range - instead of an observed range, and would ideally repeat the full-network cycle across multiple days to capture operational variability. Because every successful collection is already committed to Git (Section 3), the commit history of the deployment's GitStore is itself a candidate raw dataset for this analysis and is retained for a future controlled study.</w:t>
+      </w:r>
+    </w:p>
+    <w:p>
+      <w:pPr>
+        <w:ind w:firstLine="202"/>
+        <w:rPr/>
+      </w:pPr>
+      <w:r>
+        <w:rPr>
+          <w:rFonts w:ascii="Times New Roman" w:cs="Times New Roman" w:eastAsia="Times New Roman" w:hAnsi="Times New Roman"/>
+          <w:sz w:val="20"/>
+          <w:szCs w:val="20"/>
+          <w:rtl w:val="0"/>
+        </w:rPr>
+        <w:t xml:space="preserve">Second, the topology-inference algorithm (Section 4.4) has not been validated against a ground-truth topology. The evidentiary tiers in Table 2 describe the logical or heuristic strength of the static evidence used to infer a link, not a statistically calibrated confidence score, and no precision or recall figures are reported because no independent reference topology was compared against the algorithm's output. Closing this gap requires assembling a ground-truth map from the manual surveys historically used to document the network (Section 1) - for at least one representative segment - and computing precision and recall separately for each evidentiary tier, which would also indicate whether the deterministic tier is empirically as reliable in practice as its logical justification suggests.</w:t>
+      </w:r>
+    </w:p>
+    <w:p>
+      <w:pPr>
+        <w:ind w:firstLine="202"/>
+        <w:rPr/>
+      </w:pPr>
+      <w:r>
+        <w:rPr>
+          <w:rFonts w:ascii="Times New Roman" w:cs="Times New Roman" w:eastAsia="Times New Roman" w:hAnsi="Times New Roman"/>
+          <w:sz w:val="20"/>
+          <w:szCs w:val="20"/>
+          <w:rtl w:val="0"/>
+        </w:rPr>
+        <w:t xml:space="preserve">Third, the comparison with Oxidized (Table 4, Section 6.2) is qualitative on every vector. This is an unavoidable limitation on the legacy segments, where Oxidized cannot operate safely at all (Section 6.2); it is not unavoidable, however, on the modern edge and expansion segments (Cisco IOS/IOS-XE, MikroTik RouterOS, TP-Link JetStream/ER - Table 1), which are standards-compliant enough for Oxidized to run. A quantitative head-to-head timing comparison restricted to those devices - running both tools against the same nodes across a matched number of trials - is feasible with the infrastructure already in production and is the most immediately actionable extension of this evaluation.</w:t>
+      </w:r>
+    </w:p>
+    <w:p>
+      <w:pPr>
+        <w:rPr/>
+      </w:pPr>
+    </w:p>
+    <w:p>
+      <w:pPr>
+        <w:keepNext w:val="1"/>
+        <w:jc w:val="left"/>
+        <w:rPr>
+          <w:b w:val="1"/>
+          <w:bCs w:val="1"/>
+        </w:rPr>
+      </w:pPr>
+      <w:r>
+        <w:rPr>
+          <w:rFonts w:ascii="Times New Roman" w:cs="Times New Roman" w:eastAsia="Times New Roman" w:hAnsi="Times New Roman"/>
+          <w:b w:val="1"/>
+          <w:bCs w:val="1"/>
+          <w:sz w:val="20"/>
+          <w:szCs w:val="20"/>
+          <w:rtl w:val="0"/>
+        </w:rPr>
+        <w:t xml:space="preserve">7.2 Design limitations and security considerations</w:t>
+      </w:r>
+    </w:p>
+    <w:p>
+      <w:pPr>
+        <w:rPr/>
+      </w:pPr>
+    </w:p>
+    <w:p>
+      <w:pPr>
+        <w:ind w:firstLine="202"/>
+        <w:rPr/>
+      </w:pPr>
+      <w:r>
+        <w:rPr>
+          <w:rFonts w:ascii="Times New Roman" w:cs="Times New Roman" w:eastAsia="Times New Roman" w:hAnsi="Times New Roman"/>
+          <w:sz w:val="20"/>
+          <w:szCs w:val="20"/>
+          <w:rtl w:val="0"/>
+        </w:rPr>
+        <w:t xml:space="preserve">Three further design limitations and security considerations deserve emphasis. First, controlled concurrency and commit serialization protect both the management CPU of older switches and the consistency of the Git index, at the cost of a bounded increase in total collection time - an acceptable trade-off given the sub-4-minute full-network figure (Table 3). Second, configuration dumps contain password hashes and SNMP management parameters; the repository must therefore reside in a strictly private environment, and the system complementarily integrates a cryptographic sanitization module for contexts that require secret anonymization [21]. Third, the formal distinction between production-validated and simulator-validated drivers acknowledges that a digital twin, however faithful [18], cannot fully substitute first-contact validation on real hardware.</w:t>
+      </w:r>
+    </w:p>
+    <w:p>
+      <w:pPr>
+        <w:rPr/>
+      </w:pPr>
+    </w:p>
+    <w:p>
+      <w:pPr>
+        <w:keepNext w:val="1"/>
+        <w:jc w:val="left"/>
+        <w:rPr>
+          <w:b w:val="1"/>
+          <w:bCs w:val="1"/>
+        </w:rPr>
+      </w:pPr>
+      <w:r>
+        <w:rPr>
+          <w:rFonts w:ascii="Times New Roman" w:cs="Times New Roman" w:eastAsia="Times New Roman" w:hAnsi="Times New Roman"/>
+          <w:b w:val="1"/>
+          <w:bCs w:val="1"/>
+          <w:sz w:val="20"/>
+          <w:szCs w:val="20"/>
+          <w:rtl w:val="0"/>
+        </w:rPr>
+        <w:t xml:space="preserve">7.3 Pedagogical dimension</w:t>
+      </w:r>
+    </w:p>
+    <w:p>
+      <w:pPr>
+        <w:rPr/>
+      </w:pPr>
+    </w:p>
+    <w:p>
+      <w:pPr>
+        <w:ind w:firstLine="202"/>
+        <w:rPr/>
+      </w:pPr>
+      <w:r>
+        <w:rPr>
+          <w:rFonts w:ascii="Times New Roman" w:cs="Times New Roman" w:eastAsia="Times New Roman" w:hAnsi="Times New Roman"/>
+          <w:sz w:val="20"/>
+          <w:szCs w:val="20"/>
+          <w:rtl w:val="0"/>
+        </w:rPr>
+        <w:t xml:space="preserve">Finally, the project has a deliberate pedagogical dimension. Developed within the Network Automation Project III, the system articulates data-network concepts (link and network layers, VLANs, routing) with modern software-engineering practice (version control, API design, concurrency, text analysis), and its fully documented development serves as reference material and a laboratory base for future academic cohorts.</w:t>
+      </w:r>
+    </w:p>
+    <w:p>
+      <w:pPr>
+        <w:rPr/>
+      </w:pPr>
+    </w:p>
+    <w:p>
+      <w:pPr>
+        <w:rPr/>
+      </w:pPr>
+    </w:p>
+    <w:p>
+      <w:pPr>
+        <w:keepNext w:val="1"/>
+        <w:jc w:val="left"/>
+        <w:rPr>
+          <w:b w:val="1"/>
+          <w:bCs w:val="1"/>
+        </w:rPr>
+      </w:pPr>
+      <w:r>
+        <w:rPr>
+          <w:rFonts w:ascii="Times New Roman" w:cs="Times New Roman" w:eastAsia="Times New Roman" w:hAnsi="Times New Roman"/>
+          <w:b w:val="1"/>
+          <w:bCs w:val="1"/>
+          <w:sz w:val="20"/>
+          <w:szCs w:val="20"/>
+          <w:rtl w:val="0"/>
+        </w:rPr>
         <w:t xml:space="preserve">8. CONCLUSIONS</w:t>
       </w:r>
     </w:p>
@@ -5075,7 +5335,7 @@
           <w:szCs w:val="20"/>
           <w:rtl w:val="0"/>
         </w:rPr>
-        <w:t xml:space="preserve">The platform developed for the Network Automation Project III demonstrates that the application of software-engineering and infrastructure-as-code principles can resolve complex operational problems in heterogeneous, legacy-laden networks. By providing a safe backup workflow, rigorous Git-based traceability, automated topology deduction, and active hardware-protection mechanisms, the system reduced per-device backup time by roughly an order of magnitude, brought full-network unattended backup under four minutes, and cut the mean time to recovery from hours or days to under two minutes, while producing a configuration history that is fully auditable and free of volatile noise.</w:t>
+        <w:t xml:space="preserve">The platform developed for the Network Automation Project III demonstrates that the application of software-engineering and infrastructure-as-code principles can resolve complex operational problems in heterogeneous, legacy-laden networks. By providing a safe backup workflow, rigorous Git-based traceability, automated topology deduction, and active hardware-protection mechanisms, the system was observed, in a single-site pilot deployment, to reduce per-device backup time by roughly an order of magnitude, bring full-network unattended backup under four minutes, and cut the mean time to recovery from hours or days to under two minutes, while producing a configuration history that is fully auditable and free of volatile noise. Section 7.1 details the statistical and comparative rigor a follow-up evaluation would still need to add.</w:t>
       </w:r>
     </w:p>
     <w:p>

</xml_diff>

<commit_message>
Final submission polish: acknowledgment, future work, reproducibility note
- Replace the placeholder Acknowledgment with real institutional credit
  (CIDI/UNSAM and the host institution's network administration staff).
- Add a fifth Future Work line tying the three 7.1 validation protocols
  (timing statistics, topology ground-truth, quantitative Oxidized
  comparison) into concrete next steps, instead of leaving them implicit.
- Reference analyze_gitstore_timings.py from the Appendix as part of the
  reproducibility statement.

Co-Authored-By: Claude Sonnet 5 <noreply@anthropic.com>
</commit_message>
<xml_diff>
--- a/paper/RCES_Paper_AutoRedes_III.docx
+++ b/paper/RCES_Paper_AutoRedes_III.docx
@@ -5401,7 +5401,7 @@
           <w:szCs w:val="20"/>
           <w:rtl w:val="0"/>
         </w:rPr>
-        <w:t xml:space="preserve">Planned extensions follow four lines. First, fine physical resolution of trunk links: ingesting and correlating MAC address tables to assign, with absolute precision, the physical port number to links currently deduced at the VLAN level. Second, structured-cabling registration: a versioned scheme to document static fiber and copper runs that carry no software-deducible frames. Third, remote configuration restoration and provisioning from the web interface, strictly conditioned on the prior incorporation of an authentication and role-based access control (RBAC) layer for the web API. Fourth, health supervision and telemetry (Phase 3): availability and link-state monitoring in near real time through lightweight ICMP/SNMP probes [20], keeping the platform's zero-overhead philosophy.</w:t>
+        <w:t xml:space="preserve">Planned extensions follow five lines. First, fine physical resolution of trunk links: ingesting and correlating MAC address tables to assign, with absolute precision, the physical port number to links currently deduced at the VLAN level. Second, structured-cabling registration: a versioned scheme to document static fiber and copper runs that carry no software-deducible frames. Third, remote configuration restoration and provisioning from the web interface, strictly conditioned on the prior incorporation of an authentication and role-based access control (RBAC) layer for the web API. Fourth, health supervision and telemetry (Phase 3): availability and link-state monitoring in near real time through lightweight ICMP/SNMP probes [20], keeping the platform's zero-overhead philosophy. Fifth, closing the empirical gaps identified in Section 7.1: running the included extraction script against the deployment's GitStore to characterize collection timings with real sample sizes and dispersion statistics, assembling a ground-truth topology map to compute precision and recall for each evidentiary tier of the inference engine, and executing a quantitative, timed comparison against Oxidized restricted to the modern segment of the network.</w:t>
       </w:r>
     </w:p>
     <w:p>
@@ -5451,7 +5451,7 @@
           <w:szCs w:val="20"/>
           <w:rtl w:val="0"/>
         </w:rPr>
-        <w:t xml:space="preserve">This work was developed within the framework of the Network Automation Project III. [Institutional acknowledgment to be completed.]</w:t>
+        <w:t xml:space="preserve">This work was developed within the framework of the Network Automation Project III at the Research and Development Center in Computer Science (CIDI), National University of San Martín (UNSAM). The authors thank the host institution's network administration staff for their cooperation and for providing access to the infrastructure throughout the pilot deployment.</w:t>
       </w:r>
     </w:p>
     <w:p>
@@ -6628,7 +6628,7 @@
           <w:szCs w:val="20"/>
           <w:rtl w:val="0"/>
         </w:rPr>
-        <w:t xml:space="preserve">Minimum environment and deployment requirements: a standard Python 3 runtime with no external relational database manager and no front-end build chain; Git available on the management host for the version store; network reachability (SSH) from the management host to the administered devices; and a strictly private location for the configuration repository, given that dumps contain password hashes and SNMP management parameters. The device simulator (fake_device.py) allows the full pipeline to be exercised on any workstation without access to production hardware.</w:t>
+        <w:t xml:space="preserve">Minimum environment and deployment requirements: a standard Python 3 runtime with no external relational database manager and no front-end build chain; Git available on the management host for the version store; network reachability (SSH) from the management host to the administered devices; and a strictly private location for the configuration repository, given that dumps contain password hashes and SNMP management parameters. The device simulator (fake_device.py) allows the full pipeline to be exercised on any workstation without access to production hardware. The project repository also includes analyze_gitstore_timings.py, the analysis tool referenced in Section 7.1 for extracting per-device-family sample size, mean, and standard deviation of collection cycle times directly from a deployment's GitStore commit history.</w:t>
       </w:r>
     </w:p>
     <w:p>

</xml_diff>